<commit_message>
excised wmic from Ex-3.1
</commit_message>
<xml_diff>
--- a/CYBER360-Ex-3.1-WMI.docx
+++ b/CYBER360-Ex-3.1-WMI.docx
@@ -354,82 +354,110 @@
     </w:p>
     <w:p>
       <w:pPr>
-        <w:rPr>
-          <w:sz w:val="22"/>
-          <w:szCs w:val="22"/>
-        </w:rPr>
-      </w:pPr>
-      <w:r>
-        <w:rPr>
-          <w:sz w:val="22"/>
-          <w:szCs w:val="22"/>
-        </w:rPr>
-        <w:t>Windows WMIC feature. Here’s a link with instructions to install this feature in Windows 11:</w:t>
-      </w:r>
-      <w:r>
-        <w:rPr>
-          <w:sz w:val="22"/>
-          <w:szCs w:val="22"/>
-        </w:rPr>
-        <w:br/>
-      </w:r>
-      <w:hyperlink r:id="rId9" w:history="1">
-        <w:r>
-          <w:rPr>
-            <w:rStyle w:val="Hyperlink"/>
-            <w:sz w:val="22"/>
-            <w:szCs w:val="22"/>
-          </w:rPr>
-          <w:t>How to install WMIC Feature on Demand on Windows 11 | Windows IT Pro Blog</w:t>
-        </w:r>
-      </w:hyperlink>
+        <w:pStyle w:val="Heading1"/>
+      </w:pPr>
+      <w:r>
+        <w:t xml:space="preserve">Task </w:t>
+      </w:r>
+      <w:r>
+        <w:t>1</w:t>
+      </w:r>
+      <w:r>
+        <w:t>—wbemtest</w:t>
+      </w:r>
     </w:p>
     <w:p>
       <w:pPr>
-        <w:pStyle w:val="Heading1"/>
-      </w:pPr>
-      <w:r>
-        <w:t xml:space="preserve">Task 1—Exploring WMI with </w:t>
-      </w:r>
-      <w:r>
-        <w:rPr>
-          <w:bCs/>
-        </w:rPr>
-        <w:t>wmic</w:t>
-      </w:r>
-      <w:r>
+        <w:rPr>
+          <w:sz w:val="22"/>
+          <w:szCs w:val="22"/>
+        </w:rPr>
+      </w:pPr>
+      <w:r>
+        <w:rPr>
+          <w:sz w:val="22"/>
+          <w:szCs w:val="22"/>
+        </w:rPr>
+        <w:t>In this task, you will use</w:t>
+      </w:r>
+      <w:r>
+        <w:rPr>
+          <w:sz w:val="22"/>
+          <w:szCs w:val="22"/>
+        </w:rPr>
+        <w:t xml:space="preserve"> a graphical </w:t>
+      </w:r>
+      <w:proofErr w:type="gramStart"/>
+      <w:r>
+        <w:rPr>
+          <w:sz w:val="22"/>
+          <w:szCs w:val="22"/>
+        </w:rPr>
+        <w:t xml:space="preserve">tool </w:t>
+      </w:r>
+      <w:r>
+        <w:rPr>
+          <w:sz w:val="22"/>
+          <w:szCs w:val="22"/>
+        </w:rPr>
         <w:t xml:space="preserve"> </w:t>
       </w:r>
-    </w:p>
-    <w:p>
-      <w:pPr>
-        <w:rPr>
-          <w:sz w:val="22"/>
-          <w:szCs w:val="22"/>
-        </w:rPr>
-      </w:pPr>
-      <w:r>
-        <w:rPr>
-          <w:sz w:val="22"/>
-          <w:szCs w:val="22"/>
-        </w:rPr>
-        <w:t xml:space="preserve">Use the command line tool </w:t>
-      </w:r>
-      <w:r>
-        <w:rPr>
+      <w:r>
+        <w:rPr>
+          <w:rFonts w:ascii="Consolas" w:hAnsi="Consolas"/>
           <w:b/>
           <w:bCs/>
           <w:sz w:val="22"/>
           <w:szCs w:val="22"/>
         </w:rPr>
-        <w:t>wmic</w:t>
-      </w:r>
-      <w:r>
-        <w:rPr>
-          <w:sz w:val="22"/>
-          <w:szCs w:val="22"/>
-        </w:rPr>
-        <w:t xml:space="preserve"> to explore WMI</w:t>
+        <w:t>wbemtest.exe</w:t>
+      </w:r>
+      <w:proofErr w:type="gramEnd"/>
+      <w:r>
+        <w:rPr>
+          <w:sz w:val="22"/>
+          <w:szCs w:val="22"/>
+        </w:rPr>
+        <w:t xml:space="preserve"> </w:t>
+      </w:r>
+      <w:r>
+        <w:rPr>
+          <w:sz w:val="22"/>
+          <w:szCs w:val="22"/>
+        </w:rPr>
+        <w:t xml:space="preserve"> </w:t>
+      </w:r>
+      <w:r>
+        <w:rPr>
+          <w:sz w:val="22"/>
+          <w:szCs w:val="22"/>
+        </w:rPr>
+        <w:t xml:space="preserve">to explore Windows Management Instrumentation (WMI). WMI organizes management information into </w:t>
+      </w:r>
+      <w:r>
+        <w:rPr>
+          <w:i/>
+          <w:iCs/>
+          <w:sz w:val="22"/>
+          <w:szCs w:val="22"/>
+        </w:rPr>
+        <w:t>namespaces</w:t>
+      </w:r>
+      <w:r>
+        <w:rPr>
+          <w:sz w:val="22"/>
+          <w:szCs w:val="22"/>
+        </w:rPr>
+        <w:t xml:space="preserve"> and </w:t>
+      </w:r>
+      <w:r>
+        <w:rPr>
+          <w:i/>
+          <w:iCs/>
+          <w:sz w:val="22"/>
+          <w:szCs w:val="22"/>
+        </w:rPr>
+        <w:t>classes</w:t>
       </w:r>
       <w:r>
         <w:rPr>
@@ -437,14 +465,6 @@
           <w:szCs w:val="22"/>
         </w:rPr>
         <w:t>.</w:t>
-      </w:r>
-    </w:p>
-    <w:p>
-      <w:pPr>
-        <w:pStyle w:val="Heading2"/>
-      </w:pPr>
-      <w:r>
-        <w:t>Steps</w:t>
       </w:r>
     </w:p>
     <w:p>
@@ -452,101 +472,40 @@
         <w:pStyle w:val="ListParagraph"/>
         <w:numPr>
           <w:ilvl w:val="0"/>
-          <w:numId w:val="9"/>
+          <w:numId w:val="14"/>
         </w:numPr>
-        <w:contextualSpacing w:val="0"/>
-        <w:rPr>
-          <w:sz w:val="22"/>
-          <w:szCs w:val="22"/>
-        </w:rPr>
-      </w:pPr>
-      <w:r>
-        <w:rPr>
-          <w:sz w:val="22"/>
-          <w:szCs w:val="22"/>
-        </w:rPr>
-        <w:t xml:space="preserve">Open </w:t>
-      </w:r>
-      <w:r>
-        <w:rPr>
-          <w:sz w:val="22"/>
-          <w:szCs w:val="22"/>
-        </w:rPr>
-        <w:t xml:space="preserve">a CMD.EXE command prompt (or Windows </w:t>
-      </w:r>
-      <w:r>
-        <w:rPr>
-          <w:sz w:val="22"/>
-          <w:szCs w:val="22"/>
-        </w:rPr>
-        <w:t>PowerShell</w:t>
-      </w:r>
-      <w:r>
-        <w:rPr>
-          <w:sz w:val="22"/>
-          <w:szCs w:val="22"/>
-        </w:rPr>
-        <w:t>)</w:t>
-      </w:r>
-      <w:r>
-        <w:rPr>
-          <w:sz w:val="22"/>
-          <w:szCs w:val="22"/>
-        </w:rPr>
-        <w:t xml:space="preserve"> and start </w:t>
-      </w:r>
-      <w:r>
-        <w:rPr>
-          <w:rFonts w:cstheme="minorHAnsi"/>
-          <w:b/>
-          <w:bCs/>
-          <w:sz w:val="22"/>
-          <w:szCs w:val="22"/>
-        </w:rPr>
-        <w:t>wmic</w:t>
-      </w:r>
-      <w:r>
-        <w:rPr>
-          <w:sz w:val="22"/>
-          <w:szCs w:val="22"/>
-        </w:rPr>
-        <w:t xml:space="preserve">, which is </w:t>
-      </w:r>
-      <w:r>
-        <w:rPr>
-          <w:sz w:val="22"/>
-          <w:szCs w:val="22"/>
-        </w:rPr>
-        <w:t xml:space="preserve">an interactive command line tool that </w:t>
-      </w:r>
-      <w:r>
-        <w:rPr>
-          <w:sz w:val="22"/>
-          <w:szCs w:val="22"/>
-        </w:rPr>
-        <w:t>enables</w:t>
-      </w:r>
-      <w:r>
-        <w:rPr>
-          <w:sz w:val="22"/>
-          <w:szCs w:val="22"/>
-        </w:rPr>
-        <w:t xml:space="preserve"> access to WMI.</w:t>
-      </w:r>
-      <w:r>
-        <w:rPr>
-          <w:sz w:val="22"/>
-          <w:szCs w:val="22"/>
-        </w:rPr>
-        <w:br/>
-      </w:r>
-      <w:r>
-        <w:rPr>
-          <w:rStyle w:val="CommandChar"/>
-          <w:sz w:val="22"/>
-          <w:szCs w:val="22"/>
-        </w:rPr>
-        <w:t>wmic</w:t>
+        <w:rPr>
+          <w:sz w:val="22"/>
+          <w:szCs w:val="22"/>
+        </w:rPr>
+      </w:pPr>
+      <w:r>
+        <w:rPr>
+          <w:sz w:val="22"/>
+          <w:szCs w:val="22"/>
+        </w:rPr>
+        <w:t xml:space="preserve">Classes describe </w:t>
+      </w:r>
+      <w:r>
+        <w:rPr>
+          <w:sz w:val="22"/>
+          <w:szCs w:val="22"/>
+        </w:rPr>
+        <w:t>available</w:t>
+      </w:r>
+      <w:r>
+        <w:rPr>
+          <w:sz w:val="22"/>
+          <w:szCs w:val="22"/>
+        </w:rPr>
+        <w:t xml:space="preserve"> information</w:t>
+      </w:r>
+      <w:r>
+        <w:rPr>
+          <w:sz w:val="22"/>
+          <w:szCs w:val="22"/>
+        </w:rPr>
+        <w:t>.</w:t>
       </w:r>
     </w:p>
     <w:p>
@@ -554,1112 +513,125 @@
         <w:pStyle w:val="ListParagraph"/>
         <w:numPr>
           <w:ilvl w:val="0"/>
-          <w:numId w:val="9"/>
+          <w:numId w:val="14"/>
         </w:numPr>
-        <w:contextualSpacing w:val="0"/>
-        <w:rPr>
-          <w:sz w:val="22"/>
-          <w:szCs w:val="22"/>
-        </w:rPr>
-      </w:pPr>
-      <w:r>
-        <w:rPr>
-          <w:sz w:val="22"/>
-          <w:szCs w:val="22"/>
-        </w:rPr>
-        <w:t>You should see a prompt like</w:t>
-      </w:r>
-      <w:r>
-        <w:rPr>
-          <w:sz w:val="22"/>
-          <w:szCs w:val="22"/>
-        </w:rPr>
-        <w:br/>
-      </w:r>
-      <w:proofErr w:type="gramStart"/>
-      <w:r>
-        <w:rPr>
-          <w:rStyle w:val="CommandChar"/>
-          <w:sz w:val="22"/>
-          <w:szCs w:val="22"/>
-        </w:rPr>
-        <w:t>wmic:root</w:t>
-      </w:r>
-      <w:proofErr w:type="gramEnd"/>
-      <w:r>
-        <w:rPr>
-          <w:rStyle w:val="CommandChar"/>
-          <w:sz w:val="22"/>
-          <w:szCs w:val="22"/>
-        </w:rPr>
-        <w:t>\cli&gt;</w:t>
+        <w:rPr>
+          <w:sz w:val="22"/>
+          <w:szCs w:val="22"/>
+        </w:rPr>
+      </w:pPr>
+      <w:r>
+        <w:rPr>
+          <w:sz w:val="22"/>
+          <w:szCs w:val="22"/>
+        </w:rPr>
+        <w:t>I</w:t>
+      </w:r>
+      <w:r>
+        <w:rPr>
+          <w:sz w:val="22"/>
+          <w:szCs w:val="22"/>
+        </w:rPr>
+        <w:t xml:space="preserve">nstances contain </w:t>
+      </w:r>
+      <w:r>
+        <w:rPr>
+          <w:sz w:val="22"/>
+          <w:szCs w:val="22"/>
+        </w:rPr>
+        <w:t>actual</w:t>
+      </w:r>
+      <w:r>
+        <w:rPr>
+          <w:sz w:val="22"/>
+          <w:szCs w:val="22"/>
+        </w:rPr>
+        <w:t xml:space="preserve"> data reported by the computer.</w:t>
       </w:r>
     </w:p>
     <w:p>
       <w:pPr>
-        <w:pStyle w:val="ListParagraph"/>
-        <w:numPr>
-          <w:ilvl w:val="0"/>
-          <w:numId w:val="9"/>
-        </w:numPr>
-        <w:contextualSpacing w:val="0"/>
-        <w:rPr>
-          <w:sz w:val="22"/>
-          <w:szCs w:val="22"/>
-        </w:rPr>
-      </w:pPr>
-      <w:r>
-        <w:rPr>
-          <w:sz w:val="22"/>
-          <w:szCs w:val="22"/>
-        </w:rPr>
-        <w:t>The easiest way to retrieve data using wmic is to just type</w:t>
-      </w:r>
-      <w:r>
-        <w:rPr>
-          <w:sz w:val="22"/>
-          <w:szCs w:val="22"/>
-        </w:rPr>
-        <w:t xml:space="preserve"> in</w:t>
-      </w:r>
-      <w:r>
-        <w:rPr>
-          <w:sz w:val="22"/>
-          <w:szCs w:val="22"/>
-        </w:rPr>
-        <w:t xml:space="preserve"> the name of one of the aliases. You can get a list of aliases by typing</w:t>
-      </w:r>
-      <w:r>
-        <w:rPr>
-          <w:sz w:val="22"/>
-          <w:szCs w:val="22"/>
-        </w:rPr>
-        <w:t>:</w:t>
-      </w:r>
-      <w:r>
-        <w:rPr>
-          <w:sz w:val="22"/>
-          <w:szCs w:val="22"/>
-        </w:rPr>
-        <w:t xml:space="preserve"> /?</w:t>
-      </w:r>
-      <w:r>
-        <w:rPr>
-          <w:sz w:val="22"/>
-          <w:szCs w:val="22"/>
-        </w:rPr>
-        <w:br/>
-      </w:r>
-      <w:r>
-        <w:rPr>
-          <w:rStyle w:val="CommandChar"/>
-          <w:sz w:val="22"/>
-          <w:szCs w:val="22"/>
-        </w:rPr>
-        <w:t>/?</w:t>
-      </w:r>
-      <w:r>
-        <w:rPr>
-          <w:rStyle w:val="CommandChar"/>
-          <w:rFonts w:asciiTheme="minorHAnsi" w:hAnsiTheme="minorHAnsi" w:cstheme="minorHAnsi"/>
-          <w:b w:val="0"/>
-          <w:bCs/>
-          <w:sz w:val="22"/>
-          <w:szCs w:val="22"/>
-        </w:rPr>
-        <w:t xml:space="preserve"> </w:t>
-      </w:r>
-      <w:r>
-        <w:rPr>
-          <w:rStyle w:val="CommandChar"/>
-          <w:rFonts w:asciiTheme="minorHAnsi" w:hAnsiTheme="minorHAnsi" w:cstheme="minorHAnsi"/>
-          <w:b w:val="0"/>
-          <w:bCs/>
-          <w:sz w:val="22"/>
-          <w:szCs w:val="22"/>
-        </w:rPr>
-        <w:br/>
-        <w:t>(</w:t>
-      </w:r>
-      <w:r>
-        <w:rPr>
-          <w:rStyle w:val="CommandChar"/>
-          <w:rFonts w:asciiTheme="minorHAnsi" w:hAnsiTheme="minorHAnsi" w:cstheme="minorHAnsi"/>
-          <w:b w:val="0"/>
-          <w:bCs/>
-          <w:i/>
-          <w:iCs/>
-          <w:sz w:val="22"/>
-          <w:szCs w:val="22"/>
-        </w:rPr>
-        <w:t>Note: if</w:t>
-      </w:r>
-      <w:r>
-        <w:rPr>
-          <w:rStyle w:val="CommandChar"/>
-          <w:rFonts w:asciiTheme="minorHAnsi" w:hAnsiTheme="minorHAnsi" w:cstheme="minorHAnsi"/>
-          <w:b w:val="0"/>
-          <w:bCs/>
-          <w:sz w:val="22"/>
-          <w:szCs w:val="22"/>
-        </w:rPr>
-        <w:t xml:space="preserve"> </w:t>
-      </w:r>
-      <w:r>
-        <w:rPr>
-          <w:rStyle w:val="CommandChar"/>
-          <w:rFonts w:cstheme="minorHAnsi"/>
-          <w:sz w:val="22"/>
-          <w:szCs w:val="22"/>
-        </w:rPr>
-        <w:t>/?</w:t>
-      </w:r>
-      <w:r>
-        <w:rPr>
-          <w:rStyle w:val="CommandChar"/>
-          <w:rFonts w:asciiTheme="minorHAnsi" w:hAnsiTheme="minorHAnsi" w:cstheme="minorHAnsi"/>
-          <w:b w:val="0"/>
-          <w:bCs/>
-          <w:sz w:val="22"/>
-          <w:szCs w:val="22"/>
-        </w:rPr>
-        <w:t xml:space="preserve"> </w:t>
-      </w:r>
-      <w:r>
-        <w:rPr>
-          <w:rStyle w:val="CommandChar"/>
-          <w:rFonts w:asciiTheme="minorHAnsi" w:hAnsiTheme="minorHAnsi" w:cstheme="minorHAnsi"/>
-          <w:b w:val="0"/>
-          <w:bCs/>
-          <w:i/>
-          <w:iCs/>
-          <w:sz w:val="22"/>
-          <w:szCs w:val="22"/>
-        </w:rPr>
-        <w:t xml:space="preserve">doesn’t work, try starting again at step 1, with an </w:t>
-      </w:r>
-      <w:r>
-        <w:rPr>
-          <w:rStyle w:val="CommandChar"/>
-          <w:rFonts w:asciiTheme="minorHAnsi" w:hAnsiTheme="minorHAnsi" w:cstheme="minorHAnsi"/>
-          <w:b w:val="0"/>
-          <w:bCs/>
-          <w:sz w:val="22"/>
-          <w:szCs w:val="22"/>
-        </w:rPr>
-        <w:t xml:space="preserve">administrator </w:t>
-      </w:r>
-      <w:r>
-        <w:rPr>
-          <w:rStyle w:val="CommandChar"/>
-          <w:rFonts w:asciiTheme="minorHAnsi" w:hAnsiTheme="minorHAnsi" w:cstheme="minorHAnsi"/>
-          <w:b w:val="0"/>
-          <w:bCs/>
-          <w:i/>
-          <w:iCs/>
-          <w:sz w:val="22"/>
-          <w:szCs w:val="22"/>
-        </w:rPr>
-        <w:t>privilege</w:t>
-      </w:r>
-      <w:r>
-        <w:rPr>
-          <w:rStyle w:val="CommandChar"/>
-          <w:rFonts w:asciiTheme="minorHAnsi" w:hAnsiTheme="minorHAnsi" w:cstheme="minorHAnsi"/>
-          <w:b w:val="0"/>
-          <w:bCs/>
-          <w:i/>
-          <w:iCs/>
-          <w:sz w:val="22"/>
-          <w:szCs w:val="22"/>
-        </w:rPr>
-        <w:t>d</w:t>
-      </w:r>
-      <w:r>
-        <w:rPr>
-          <w:rStyle w:val="CommandChar"/>
-          <w:rFonts w:asciiTheme="minorHAnsi" w:hAnsiTheme="minorHAnsi" w:cstheme="minorHAnsi"/>
-          <w:b w:val="0"/>
-          <w:bCs/>
-          <w:i/>
-          <w:iCs/>
-          <w:sz w:val="22"/>
-          <w:szCs w:val="22"/>
-        </w:rPr>
-        <w:t xml:space="preserve"> command prompt.</w:t>
-      </w:r>
-      <w:r>
-        <w:rPr>
-          <w:rStyle w:val="CommandChar"/>
-          <w:rFonts w:asciiTheme="minorHAnsi" w:hAnsiTheme="minorHAnsi" w:cstheme="minorHAnsi"/>
-          <w:b w:val="0"/>
-          <w:bCs/>
-          <w:sz w:val="22"/>
-          <w:szCs w:val="22"/>
-        </w:rPr>
-        <w:t>)</w:t>
-      </w:r>
-    </w:p>
-    <w:p>
-      <w:pPr>
-        <w:pStyle w:val="ListParagraph"/>
-        <w:numPr>
-          <w:ilvl w:val="0"/>
-          <w:numId w:val="9"/>
-        </w:numPr>
-        <w:contextualSpacing w:val="0"/>
-        <w:rPr>
-          <w:sz w:val="22"/>
-          <w:szCs w:val="22"/>
-        </w:rPr>
-      </w:pPr>
-      <w:r>
-        <w:rPr>
-          <w:sz w:val="22"/>
-          <w:szCs w:val="22"/>
-        </w:rPr>
-        <w:lastRenderedPageBreak/>
-        <w:t>Get a list of services running on your computer</w:t>
-      </w:r>
-      <w:r>
-        <w:rPr>
-          <w:sz w:val="22"/>
-          <w:szCs w:val="22"/>
-        </w:rPr>
-        <w:br/>
-      </w:r>
-      <w:r>
-        <w:rPr>
-          <w:rStyle w:val="CommandChar"/>
-          <w:sz w:val="22"/>
-          <w:szCs w:val="22"/>
-        </w:rPr>
-        <w:t>Service</w:t>
-      </w:r>
-    </w:p>
-    <w:p>
-      <w:pPr>
-        <w:pStyle w:val="ListParagraph"/>
-        <w:numPr>
-          <w:ilvl w:val="0"/>
-          <w:numId w:val="9"/>
-        </w:numPr>
-        <w:contextualSpacing w:val="0"/>
-        <w:rPr>
-          <w:sz w:val="22"/>
-          <w:szCs w:val="22"/>
-        </w:rPr>
-      </w:pPr>
-      <w:r>
-        <w:rPr>
-          <w:sz w:val="22"/>
-          <w:szCs w:val="22"/>
-        </w:rPr>
-        <w:t>Get a list of disks</w:t>
-      </w:r>
-      <w:r>
-        <w:rPr>
-          <w:sz w:val="22"/>
-          <w:szCs w:val="22"/>
-        </w:rPr>
-        <w:br/>
-      </w:r>
-      <w:r>
-        <w:rPr>
-          <w:rStyle w:val="CommandChar"/>
-          <w:sz w:val="22"/>
-          <w:szCs w:val="22"/>
-        </w:rPr>
-        <w:t>Logicaldisk</w:t>
-      </w:r>
-    </w:p>
-    <w:p>
-      <w:pPr>
-        <w:pStyle w:val="ListParagraph"/>
-        <w:numPr>
-          <w:ilvl w:val="1"/>
-          <w:numId w:val="9"/>
-        </w:numPr>
-        <w:contextualSpacing w:val="0"/>
-        <w:rPr>
-          <w:sz w:val="22"/>
-          <w:szCs w:val="22"/>
-        </w:rPr>
-      </w:pPr>
-      <w:r>
-        <w:rPr>
-          <w:sz w:val="22"/>
-          <w:szCs w:val="22"/>
-        </w:rPr>
-        <w:t>What logical disks are on your system?</w:t>
-      </w:r>
-      <w:sdt>
-        <w:sdtPr>
-          <w:rPr>
-            <w:rStyle w:val="AnswerChar"/>
-            <w:sz w:val="22"/>
-            <w:szCs w:val="22"/>
-          </w:rPr>
-          <w:id w:val="1205902904"/>
-          <w:placeholder>
-            <w:docPart w:val="8FA4E9301FF6415DB984F1EB81B6DEA5"/>
-          </w:placeholder>
-          <w:showingPlcHdr/>
-          <w15:color w:val="800000"/>
-          <w15:appearance w15:val="tags"/>
-          <w:text w:multiLine="1"/>
-        </w:sdtPr>
-        <w:sdtEndPr>
-          <w:rPr>
-            <w:rStyle w:val="DefaultParagraphFont"/>
-            <w:color w:val="auto"/>
-          </w:rPr>
-        </w:sdtEndPr>
-        <w:sdtContent>
-          <w:r>
-            <w:rPr>
-              <w:rStyle w:val="PlaceholderText"/>
-              <w:sz w:val="22"/>
-              <w:szCs w:val="22"/>
-            </w:rPr>
-            <w:t>Click or tap here to enter text.</w:t>
-          </w:r>
-        </w:sdtContent>
-      </w:sdt>
-    </w:p>
-    <w:p>
-      <w:pPr>
-        <w:pStyle w:val="ListParagraph"/>
-        <w:numPr>
-          <w:ilvl w:val="0"/>
-          <w:numId w:val="9"/>
-        </w:numPr>
-        <w:contextualSpacing w:val="0"/>
-        <w:rPr>
-          <w:sz w:val="22"/>
-          <w:szCs w:val="22"/>
-        </w:rPr>
-      </w:pPr>
-      <w:r>
-        <w:rPr>
-          <w:sz w:val="22"/>
-          <w:szCs w:val="22"/>
-        </w:rPr>
-        <w:t>Get a list of volumes</w:t>
-      </w:r>
-      <w:r>
-        <w:rPr>
-          <w:sz w:val="22"/>
-          <w:szCs w:val="22"/>
-        </w:rPr>
-        <w:br/>
-      </w:r>
-      <w:r>
-        <w:rPr>
-          <w:rStyle w:val="CommandChar"/>
-          <w:sz w:val="22"/>
-          <w:szCs w:val="22"/>
-        </w:rPr>
-        <w:t>Volume</w:t>
-      </w:r>
-    </w:p>
-    <w:p>
-      <w:pPr>
-        <w:pStyle w:val="ListParagraph"/>
-        <w:numPr>
-          <w:ilvl w:val="1"/>
-          <w:numId w:val="9"/>
-        </w:numPr>
-        <w:contextualSpacing w:val="0"/>
-        <w:rPr>
-          <w:sz w:val="22"/>
-          <w:szCs w:val="22"/>
-        </w:rPr>
-      </w:pPr>
-      <w:r>
-        <w:rPr>
-          <w:sz w:val="22"/>
-          <w:szCs w:val="22"/>
-        </w:rPr>
-        <w:t>List each volume with its block</w:t>
-      </w:r>
-      <w:r>
-        <w:rPr>
-          <w:sz w:val="22"/>
-          <w:szCs w:val="22"/>
-        </w:rPr>
-        <w:t xml:space="preserve"> </w:t>
-      </w:r>
-      <w:r>
-        <w:rPr>
-          <w:sz w:val="22"/>
-          <w:szCs w:val="22"/>
-        </w:rPr>
-        <w:t>size and capacity</w:t>
-      </w:r>
-      <w:r>
-        <w:rPr>
-          <w:sz w:val="22"/>
-          <w:szCs w:val="22"/>
-        </w:rPr>
-        <w:t>:</w:t>
-      </w:r>
-      <w:r>
-        <w:rPr>
-          <w:rStyle w:val="AnswerChar"/>
-          <w:sz w:val="22"/>
-          <w:szCs w:val="22"/>
-        </w:rPr>
-        <w:t xml:space="preserve"> </w:t>
-      </w:r>
-      <w:sdt>
-        <w:sdtPr>
-          <w:rPr>
-            <w:sz w:val="22"/>
-            <w:szCs w:val="22"/>
-          </w:rPr>
-          <w:id w:val="-1016544794"/>
-          <w:placeholder>
-            <w:docPart w:val="DA20C8477E6E43F0B5F01D171B90F4D9"/>
-          </w:placeholder>
-          <w:showingPlcHdr/>
-          <w15:color w:val="800000"/>
-          <w15:appearance w15:val="tags"/>
-          <w:text w:multiLine="1"/>
-        </w:sdtPr>
-        <w:sdtContent>
-          <w:r>
-            <w:rPr>
-              <w:rStyle w:val="PlaceholderText"/>
-              <w:sz w:val="22"/>
-              <w:szCs w:val="22"/>
-            </w:rPr>
-            <w:t>Click or tap here to enter text.</w:t>
-          </w:r>
-        </w:sdtContent>
-      </w:sdt>
-    </w:p>
-    <w:p>
-      <w:pPr>
-        <w:pStyle w:val="ListParagraph"/>
-        <w:numPr>
-          <w:ilvl w:val="0"/>
-          <w:numId w:val="9"/>
-        </w:numPr>
-        <w:contextualSpacing w:val="0"/>
-        <w:rPr>
-          <w:sz w:val="22"/>
-          <w:szCs w:val="22"/>
-        </w:rPr>
-      </w:pPr>
-      <w:r>
-        <w:rPr>
-          <w:sz w:val="22"/>
-          <w:szCs w:val="22"/>
-        </w:rPr>
-        <w:t xml:space="preserve">Explore 4 more aliases </w:t>
-      </w:r>
-      <w:r>
-        <w:rPr>
-          <w:sz w:val="22"/>
-          <w:szCs w:val="22"/>
-        </w:rPr>
-        <w:t xml:space="preserve">of your </w:t>
-      </w:r>
-      <w:proofErr w:type="gramStart"/>
-      <w:r>
-        <w:rPr>
-          <w:sz w:val="22"/>
-          <w:szCs w:val="22"/>
-        </w:rPr>
-        <w:t>choice, and</w:t>
-      </w:r>
-      <w:proofErr w:type="gramEnd"/>
-      <w:r>
-        <w:rPr>
-          <w:sz w:val="22"/>
-          <w:szCs w:val="22"/>
-        </w:rPr>
-        <w:t xml:space="preserve"> </w:t>
-      </w:r>
-      <w:r>
-        <w:rPr>
-          <w:sz w:val="22"/>
-          <w:szCs w:val="22"/>
-        </w:rPr>
-        <w:t>record your results</w:t>
-      </w:r>
-      <w:r>
-        <w:rPr>
-          <w:sz w:val="22"/>
-          <w:szCs w:val="22"/>
-        </w:rPr>
-        <w:t>.</w:t>
-      </w:r>
-    </w:p>
-    <w:p>
-      <w:pPr>
-        <w:pStyle w:val="ListParagraph"/>
-        <w:numPr>
-          <w:ilvl w:val="1"/>
-          <w:numId w:val="9"/>
-        </w:numPr>
-        <w:contextualSpacing w:val="0"/>
-        <w:rPr>
-          <w:rStyle w:val="AnswerChar"/>
-          <w:color w:val="auto"/>
-          <w:sz w:val="22"/>
-          <w:szCs w:val="22"/>
-        </w:rPr>
-      </w:pPr>
-      <w:r>
-        <w:rPr>
-          <w:sz w:val="22"/>
-          <w:szCs w:val="22"/>
-        </w:rPr>
-        <w:t xml:space="preserve">Alias </w:t>
-      </w:r>
-      <w:sdt>
-        <w:sdtPr>
-          <w:rPr>
-            <w:rStyle w:val="AnswerChar"/>
-            <w:sz w:val="22"/>
-            <w:szCs w:val="22"/>
-          </w:rPr>
-          <w:id w:val="24830511"/>
-          <w:placeholder>
-            <w:docPart w:val="3814FEE2A0D847BBABBC6B3D4287482C"/>
-          </w:placeholder>
-          <w:showingPlcHdr/>
-          <w15:color w:val="800000"/>
-          <w15:appearance w15:val="tags"/>
-          <w:text w:multiLine="1"/>
-        </w:sdtPr>
-        <w:sdtEndPr>
-          <w:rPr>
-            <w:rStyle w:val="DefaultParagraphFont"/>
-            <w:color w:val="auto"/>
-          </w:rPr>
-        </w:sdtEndPr>
-        <w:sdtContent>
-          <w:r>
-            <w:rPr>
-              <w:rStyle w:val="PlaceholderText"/>
-              <w:sz w:val="22"/>
-              <w:szCs w:val="22"/>
-            </w:rPr>
-            <w:t>Click or tap here to enter text.</w:t>
-          </w:r>
-        </w:sdtContent>
-      </w:sdt>
-      <w:r>
-        <w:rPr>
-          <w:rStyle w:val="AnswerChar"/>
-          <w:sz w:val="22"/>
-          <w:szCs w:val="22"/>
-        </w:rPr>
-        <w:t xml:space="preserve"> </w:t>
-      </w:r>
-      <w:r>
-        <w:rPr>
-          <w:rStyle w:val="AnswerChar"/>
-          <w:color w:val="auto"/>
-          <w:sz w:val="22"/>
-          <w:szCs w:val="22"/>
-        </w:rPr>
-        <w:t xml:space="preserve">Results </w:t>
-      </w:r>
-      <w:sdt>
-        <w:sdtPr>
-          <w:rPr>
-            <w:rStyle w:val="AnswerChar"/>
-            <w:sz w:val="22"/>
-            <w:szCs w:val="22"/>
-          </w:rPr>
-          <w:id w:val="1504622567"/>
-          <w:placeholder>
-            <w:docPart w:val="619B9E27C1F140BCBA5A7967BA666CF9"/>
-          </w:placeholder>
-          <w:showingPlcHdr/>
-          <w15:color w:val="800000"/>
-          <w15:appearance w15:val="tags"/>
-          <w:text w:multiLine="1"/>
-        </w:sdtPr>
-        <w:sdtEndPr>
-          <w:rPr>
-            <w:rStyle w:val="DefaultParagraphFont"/>
-            <w:color w:val="auto"/>
-          </w:rPr>
-        </w:sdtEndPr>
-        <w:sdtContent>
-          <w:r>
-            <w:rPr>
-              <w:rStyle w:val="PlaceholderText"/>
-              <w:sz w:val="22"/>
-              <w:szCs w:val="22"/>
-            </w:rPr>
-            <w:t>Click or tap here to enter text.</w:t>
-          </w:r>
-        </w:sdtContent>
-      </w:sdt>
-    </w:p>
-    <w:p>
-      <w:pPr>
-        <w:pStyle w:val="ListParagraph"/>
-        <w:numPr>
-          <w:ilvl w:val="1"/>
-          <w:numId w:val="9"/>
-        </w:numPr>
-        <w:contextualSpacing w:val="0"/>
-        <w:rPr>
-          <w:sz w:val="22"/>
-          <w:szCs w:val="22"/>
-        </w:rPr>
-      </w:pPr>
-      <w:r>
-        <w:rPr>
-          <w:sz w:val="22"/>
-          <w:szCs w:val="22"/>
-        </w:rPr>
-        <w:t xml:space="preserve">Alias </w:t>
-      </w:r>
-      <w:sdt>
-        <w:sdtPr>
-          <w:rPr>
-            <w:rStyle w:val="AnswerChar"/>
-            <w:sz w:val="22"/>
-            <w:szCs w:val="22"/>
-          </w:rPr>
-          <w:id w:val="-870075786"/>
-          <w:placeholder>
-            <w:docPart w:val="9E72D17B261D4A5D9E6B522010C22637"/>
-          </w:placeholder>
-          <w:showingPlcHdr/>
-          <w15:color w:val="800000"/>
-          <w15:appearance w15:val="tags"/>
-          <w:text w:multiLine="1"/>
-        </w:sdtPr>
-        <w:sdtEndPr>
-          <w:rPr>
-            <w:rStyle w:val="DefaultParagraphFont"/>
-            <w:color w:val="auto"/>
-          </w:rPr>
-        </w:sdtEndPr>
-        <w:sdtContent>
-          <w:r>
-            <w:rPr>
-              <w:rStyle w:val="PlaceholderText"/>
-              <w:sz w:val="22"/>
-              <w:szCs w:val="22"/>
-            </w:rPr>
-            <w:t>Click or tap here to enter text.</w:t>
-          </w:r>
-        </w:sdtContent>
-      </w:sdt>
-      <w:r>
-        <w:rPr>
-          <w:rStyle w:val="AnswerChar"/>
-          <w:sz w:val="22"/>
-          <w:szCs w:val="22"/>
-        </w:rPr>
-        <w:t xml:space="preserve"> </w:t>
-      </w:r>
-      <w:r>
-        <w:rPr>
-          <w:rStyle w:val="AnswerChar"/>
-          <w:color w:val="auto"/>
-          <w:sz w:val="22"/>
-          <w:szCs w:val="22"/>
-        </w:rPr>
-        <w:t xml:space="preserve">Results </w:t>
-      </w:r>
-      <w:sdt>
-        <w:sdtPr>
-          <w:rPr>
-            <w:rStyle w:val="AnswerChar"/>
-            <w:sz w:val="22"/>
-            <w:szCs w:val="22"/>
-          </w:rPr>
-          <w:id w:val="-1359741379"/>
-          <w:placeholder>
-            <w:docPart w:val="8AAAE8712DA04C2AB0BA55AE98F1936A"/>
-          </w:placeholder>
-          <w:showingPlcHdr/>
-          <w15:color w:val="800000"/>
-          <w15:appearance w15:val="tags"/>
-          <w:text w:multiLine="1"/>
-        </w:sdtPr>
-        <w:sdtEndPr>
-          <w:rPr>
-            <w:rStyle w:val="DefaultParagraphFont"/>
-            <w:color w:val="auto"/>
-          </w:rPr>
-        </w:sdtEndPr>
-        <w:sdtContent>
-          <w:r>
-            <w:rPr>
-              <w:rStyle w:val="PlaceholderText"/>
-              <w:sz w:val="22"/>
-              <w:szCs w:val="22"/>
-            </w:rPr>
-            <w:t>Click or tap here to enter text.</w:t>
-          </w:r>
-        </w:sdtContent>
-      </w:sdt>
-    </w:p>
-    <w:p>
-      <w:pPr>
-        <w:pStyle w:val="ListParagraph"/>
-        <w:numPr>
-          <w:ilvl w:val="1"/>
-          <w:numId w:val="9"/>
-        </w:numPr>
-        <w:contextualSpacing w:val="0"/>
-        <w:rPr>
-          <w:sz w:val="22"/>
-          <w:szCs w:val="22"/>
-        </w:rPr>
-      </w:pPr>
-      <w:r>
-        <w:rPr>
-          <w:sz w:val="22"/>
-          <w:szCs w:val="22"/>
-        </w:rPr>
-        <w:t xml:space="preserve">Alias </w:t>
-      </w:r>
-      <w:sdt>
-        <w:sdtPr>
-          <w:rPr>
-            <w:rStyle w:val="AnswerChar"/>
-            <w:sz w:val="22"/>
-            <w:szCs w:val="22"/>
-          </w:rPr>
-          <w:id w:val="842975096"/>
-          <w:placeholder>
-            <w:docPart w:val="4B88A26A71E6477395276AB8D6CC06B9"/>
-          </w:placeholder>
-          <w:showingPlcHdr/>
-          <w15:color w:val="800000"/>
-          <w15:appearance w15:val="tags"/>
-          <w:text w:multiLine="1"/>
-        </w:sdtPr>
-        <w:sdtEndPr>
-          <w:rPr>
-            <w:rStyle w:val="DefaultParagraphFont"/>
-            <w:color w:val="auto"/>
-          </w:rPr>
-        </w:sdtEndPr>
-        <w:sdtContent>
-          <w:r>
-            <w:rPr>
-              <w:rStyle w:val="PlaceholderText"/>
-              <w:sz w:val="22"/>
-              <w:szCs w:val="22"/>
-            </w:rPr>
-            <w:t>Click or tap here to enter text.</w:t>
-          </w:r>
-        </w:sdtContent>
-      </w:sdt>
-      <w:r>
-        <w:rPr>
-          <w:rStyle w:val="AnswerChar"/>
-          <w:sz w:val="22"/>
-          <w:szCs w:val="22"/>
-        </w:rPr>
-        <w:t xml:space="preserve"> </w:t>
-      </w:r>
-      <w:r>
-        <w:rPr>
-          <w:rStyle w:val="AnswerChar"/>
-          <w:color w:val="auto"/>
-          <w:sz w:val="22"/>
-          <w:szCs w:val="22"/>
-        </w:rPr>
-        <w:t xml:space="preserve">Results </w:t>
-      </w:r>
-      <w:sdt>
-        <w:sdtPr>
-          <w:rPr>
-            <w:rStyle w:val="AnswerChar"/>
-            <w:sz w:val="22"/>
-            <w:szCs w:val="22"/>
-          </w:rPr>
-          <w:id w:val="-1481832162"/>
-          <w:placeholder>
-            <w:docPart w:val="FD7B5F1073894CCAB09EF2DF50B6EAAF"/>
-          </w:placeholder>
-          <w:showingPlcHdr/>
-          <w15:color w:val="800000"/>
-          <w15:appearance w15:val="tags"/>
-          <w:text w:multiLine="1"/>
-        </w:sdtPr>
-        <w:sdtEndPr>
-          <w:rPr>
-            <w:rStyle w:val="DefaultParagraphFont"/>
-            <w:color w:val="auto"/>
-          </w:rPr>
-        </w:sdtEndPr>
-        <w:sdtContent>
-          <w:r>
-            <w:rPr>
-              <w:rStyle w:val="PlaceholderText"/>
-              <w:sz w:val="22"/>
-              <w:szCs w:val="22"/>
-            </w:rPr>
-            <w:t>Click or tap here to enter text.</w:t>
-          </w:r>
-        </w:sdtContent>
-      </w:sdt>
-    </w:p>
-    <w:p>
-      <w:pPr>
-        <w:pStyle w:val="ListParagraph"/>
-        <w:numPr>
-          <w:ilvl w:val="1"/>
-          <w:numId w:val="9"/>
-        </w:numPr>
-        <w:contextualSpacing w:val="0"/>
-        <w:rPr>
-          <w:rStyle w:val="AnswerChar"/>
-          <w:color w:val="auto"/>
-          <w:sz w:val="22"/>
-          <w:szCs w:val="22"/>
-        </w:rPr>
-      </w:pPr>
-      <w:r>
-        <w:rPr>
-          <w:sz w:val="22"/>
-          <w:szCs w:val="22"/>
-        </w:rPr>
-        <w:t xml:space="preserve">Alias </w:t>
-      </w:r>
-      <w:sdt>
-        <w:sdtPr>
-          <w:rPr>
-            <w:rStyle w:val="AnswerChar"/>
-            <w:sz w:val="22"/>
-            <w:szCs w:val="22"/>
-          </w:rPr>
-          <w:id w:val="79723973"/>
-          <w:placeholder>
-            <w:docPart w:val="3EA446EDEB9D43FAB59B89AFD48F9010"/>
-          </w:placeholder>
-          <w:showingPlcHdr/>
-          <w15:color w:val="800000"/>
-          <w15:appearance w15:val="tags"/>
-          <w:text w:multiLine="1"/>
-        </w:sdtPr>
-        <w:sdtEndPr>
-          <w:rPr>
-            <w:rStyle w:val="DefaultParagraphFont"/>
-            <w:color w:val="auto"/>
-          </w:rPr>
-        </w:sdtEndPr>
-        <w:sdtContent>
-          <w:r>
-            <w:rPr>
-              <w:rStyle w:val="PlaceholderText"/>
-              <w:sz w:val="22"/>
-              <w:szCs w:val="22"/>
-            </w:rPr>
-            <w:t>Click or tap here to enter text.</w:t>
-          </w:r>
-        </w:sdtContent>
-      </w:sdt>
-      <w:r>
-        <w:rPr>
-          <w:rStyle w:val="AnswerChar"/>
-          <w:sz w:val="22"/>
-          <w:szCs w:val="22"/>
-        </w:rPr>
-        <w:t xml:space="preserve"> </w:t>
-      </w:r>
-      <w:r>
-        <w:rPr>
-          <w:rStyle w:val="AnswerChar"/>
-          <w:color w:val="auto"/>
-          <w:sz w:val="22"/>
-          <w:szCs w:val="22"/>
-        </w:rPr>
-        <w:t xml:space="preserve">Results </w:t>
-      </w:r>
-      <w:sdt>
-        <w:sdtPr>
-          <w:rPr>
-            <w:rStyle w:val="AnswerChar"/>
-            <w:sz w:val="22"/>
-            <w:szCs w:val="22"/>
-          </w:rPr>
-          <w:id w:val="1107626534"/>
-          <w:placeholder>
-            <w:docPart w:val="80896633EDBA4F8E99226D3766FC3272"/>
-          </w:placeholder>
-          <w:showingPlcHdr/>
-          <w15:color w:val="800000"/>
-          <w15:appearance w15:val="tags"/>
-          <w:text w:multiLine="1"/>
-        </w:sdtPr>
-        <w:sdtEndPr>
-          <w:rPr>
-            <w:rStyle w:val="DefaultParagraphFont"/>
-            <w:color w:val="auto"/>
-          </w:rPr>
-        </w:sdtEndPr>
-        <w:sdtContent>
-          <w:r>
-            <w:rPr>
-              <w:rStyle w:val="PlaceholderText"/>
-              <w:sz w:val="22"/>
-              <w:szCs w:val="22"/>
-            </w:rPr>
-            <w:t>Click or tap here to enter text.</w:t>
-          </w:r>
-        </w:sdtContent>
-      </w:sdt>
-    </w:p>
-    <w:p>
-      <w:pPr>
-        <w:pStyle w:val="ListParagraph"/>
-        <w:numPr>
-          <w:ilvl w:val="0"/>
-          <w:numId w:val="9"/>
-        </w:numPr>
-        <w:contextualSpacing w:val="0"/>
-        <w:rPr>
-          <w:rStyle w:val="AnswerChar"/>
-          <w:color w:val="auto"/>
-          <w:sz w:val="22"/>
-          <w:szCs w:val="22"/>
-        </w:rPr>
-      </w:pPr>
-      <w:r>
-        <w:rPr>
-          <w:rStyle w:val="AnswerChar"/>
-          <w:color w:val="auto"/>
-          <w:sz w:val="22"/>
-          <w:szCs w:val="22"/>
-        </w:rPr>
-        <w:t xml:space="preserve">Use the exit command to quit </w:t>
-      </w:r>
-      <w:r>
-        <w:rPr>
-          <w:rStyle w:val="AnswerChar"/>
-          <w:rFonts w:cstheme="minorHAnsi"/>
-          <w:b/>
-          <w:bCs/>
-          <w:color w:val="auto"/>
-          <w:sz w:val="22"/>
-          <w:szCs w:val="22"/>
-        </w:rPr>
-        <w:t>wmic</w:t>
-      </w:r>
-      <w:r>
-        <w:rPr>
-          <w:rStyle w:val="AnswerChar"/>
-          <w:color w:val="auto"/>
-          <w:sz w:val="22"/>
-          <w:szCs w:val="22"/>
-        </w:rPr>
-        <w:t>:</w:t>
-      </w:r>
-      <w:r>
-        <w:rPr>
-          <w:rStyle w:val="AnswerChar"/>
-          <w:color w:val="auto"/>
-          <w:sz w:val="22"/>
-          <w:szCs w:val="22"/>
-        </w:rPr>
-        <w:br/>
-      </w:r>
-      <w:r>
-        <w:rPr>
-          <w:rStyle w:val="CommandChar"/>
-          <w:sz w:val="22"/>
-          <w:szCs w:val="22"/>
-        </w:rPr>
-        <w:t>e</w:t>
-      </w:r>
-      <w:r>
-        <w:rPr>
-          <w:rStyle w:val="CommandChar"/>
-          <w:sz w:val="22"/>
-          <w:szCs w:val="22"/>
-        </w:rPr>
-        <w:t>xit</w:t>
-      </w:r>
-    </w:p>
-    <w:p>
-      <w:pPr>
-        <w:pStyle w:val="Heading1"/>
-      </w:pPr>
-      <w:r>
-        <w:t>Task 2—wbemtest</w:t>
-      </w:r>
-    </w:p>
-    <w:p>
-      <w:pPr>
-        <w:rPr>
-          <w:sz w:val="22"/>
-          <w:szCs w:val="22"/>
-        </w:rPr>
-      </w:pPr>
-      <w:r>
-        <w:rPr>
-          <w:sz w:val="22"/>
-          <w:szCs w:val="22"/>
-        </w:rPr>
-        <w:t>Windows provides a graphical tool to explore WMI as w</w:t>
-      </w:r>
-      <w:r>
-        <w:rPr>
-          <w:sz w:val="22"/>
-          <w:szCs w:val="22"/>
-        </w:rPr>
-        <w:t>e</w:t>
-      </w:r>
-      <w:r>
-        <w:rPr>
-          <w:sz w:val="22"/>
-          <w:szCs w:val="22"/>
-        </w:rPr>
-        <w:t>ll</w:t>
-      </w:r>
-      <w:r>
-        <w:rPr>
-          <w:sz w:val="22"/>
-          <w:szCs w:val="22"/>
-        </w:rPr>
-        <w:t>.</w:t>
-      </w:r>
-      <w:r>
-        <w:rPr>
-          <w:sz w:val="22"/>
-          <w:szCs w:val="22"/>
-        </w:rPr>
-        <w:t xml:space="preserve"> </w:t>
-      </w:r>
-      <w:r>
-        <w:rPr>
-          <w:sz w:val="22"/>
-          <w:szCs w:val="22"/>
-        </w:rPr>
-        <w:t>I</w:t>
-      </w:r>
-      <w:r>
-        <w:rPr>
-          <w:sz w:val="22"/>
-          <w:szCs w:val="22"/>
-        </w:rPr>
-        <w:t xml:space="preserve">t has many more features than </w:t>
-      </w:r>
-      <w:r>
-        <w:rPr>
-          <w:b/>
-          <w:bCs/>
-          <w:sz w:val="22"/>
-          <w:szCs w:val="22"/>
-        </w:rPr>
-        <w:t>wmic</w:t>
+        <w:rPr>
+          <w:sz w:val="22"/>
+          <w:szCs w:val="22"/>
+        </w:rPr>
+      </w:pPr>
+      <w:r>
+        <w:rPr>
+          <w:sz w:val="22"/>
+          <w:szCs w:val="22"/>
+        </w:rPr>
+        <w:t>After you explore t</w:t>
+      </w:r>
+      <w:r>
+        <w:rPr>
+          <w:sz w:val="22"/>
+          <w:szCs w:val="22"/>
+        </w:rPr>
+        <w:t>his structure graphically</w:t>
+      </w:r>
+      <w:r>
+        <w:rPr>
+          <w:sz w:val="22"/>
+          <w:szCs w:val="22"/>
+        </w:rPr>
+        <w:t xml:space="preserve">, </w:t>
+      </w:r>
+      <w:r>
+        <w:rPr>
+          <w:sz w:val="22"/>
+          <w:szCs w:val="22"/>
+        </w:rPr>
+        <w:t>subsequent tasks</w:t>
+      </w:r>
+      <w:r>
+        <w:rPr>
+          <w:sz w:val="22"/>
+          <w:szCs w:val="22"/>
+        </w:rPr>
+        <w:t xml:space="preserve"> will show </w:t>
+      </w:r>
+      <w:r>
+        <w:rPr>
+          <w:sz w:val="22"/>
+          <w:szCs w:val="22"/>
+        </w:rPr>
+        <w:t>you</w:t>
+      </w:r>
+      <w:r>
+        <w:rPr>
+          <w:sz w:val="22"/>
+          <w:szCs w:val="22"/>
+        </w:rPr>
+        <w:t xml:space="preserve"> how to use</w:t>
+      </w:r>
+      <w:r>
+        <w:rPr>
+          <w:sz w:val="22"/>
+          <w:szCs w:val="22"/>
+        </w:rPr>
+        <w:t xml:space="preserve"> WQL and Windows PowerShell to </w:t>
+      </w:r>
+      <w:r>
+        <w:rPr>
+          <w:sz w:val="22"/>
+          <w:szCs w:val="22"/>
+        </w:rPr>
+        <w:t xml:space="preserve">automate WMI data </w:t>
+      </w:r>
+      <w:r>
+        <w:rPr>
+          <w:sz w:val="22"/>
+          <w:szCs w:val="22"/>
+        </w:rPr>
+        <w:t>retrie</w:t>
+      </w:r>
+      <w:r>
+        <w:rPr>
+          <w:sz w:val="22"/>
+          <w:szCs w:val="22"/>
+        </w:rPr>
+        <w:t>val</w:t>
       </w:r>
       <w:r>
         <w:rPr>
@@ -1816,6 +788,111 @@
             <wp:extent cx="3211008" cy="2706624"/>
             <wp:effectExtent l="0" t="0" r="8890" b="0"/>
             <wp:docPr id="1" name="Picture 1"/>
+            <wp:cNvGraphicFramePr>
+              <a:graphicFrameLocks xmlns:a="http://schemas.openxmlformats.org/drawingml/2006/main" noChangeAspect="1"/>
+            </wp:cNvGraphicFramePr>
+            <a:graphic xmlns:a="http://schemas.openxmlformats.org/drawingml/2006/main">
+              <a:graphicData uri="http://schemas.openxmlformats.org/drawingml/2006/picture">
+                <pic:pic xmlns:pic="http://schemas.openxmlformats.org/drawingml/2006/picture">
+                  <pic:nvPicPr>
+                    <pic:cNvPr id="1" name=""/>
+                    <pic:cNvPicPr/>
+                  </pic:nvPicPr>
+                  <pic:blipFill>
+                    <a:blip r:embed="rId9"/>
+                    <a:stretch>
+                      <a:fillRect/>
+                    </a:stretch>
+                  </pic:blipFill>
+                  <pic:spPr>
+                    <a:xfrm>
+                      <a:off x="0" y="0"/>
+                      <a:ext cx="3221697" cy="2715634"/>
+                    </a:xfrm>
+                    <a:prstGeom prst="rect">
+                      <a:avLst/>
+                    </a:prstGeom>
+                  </pic:spPr>
+                </pic:pic>
+              </a:graphicData>
+            </a:graphic>
+          </wp:inline>
+        </w:drawing>
+      </w:r>
+    </w:p>
+    <w:p>
+      <w:pPr>
+        <w:pStyle w:val="ListParagraph"/>
+        <w:numPr>
+          <w:ilvl w:val="0"/>
+          <w:numId w:val="10"/>
+        </w:numPr>
+        <w:contextualSpacing w:val="0"/>
+        <w:rPr>
+          <w:sz w:val="22"/>
+          <w:szCs w:val="22"/>
+        </w:rPr>
+      </w:pPr>
+      <w:r>
+        <w:rPr>
+          <w:sz w:val="22"/>
+          <w:szCs w:val="22"/>
+        </w:rPr>
+        <w:t>Tap</w:t>
+      </w:r>
+      <w:r>
+        <w:rPr>
+          <w:sz w:val="22"/>
+          <w:szCs w:val="22"/>
+        </w:rPr>
+        <w:t xml:space="preserve"> the connect button</w:t>
+      </w:r>
+      <w:r>
+        <w:rPr>
+          <w:sz w:val="22"/>
+          <w:szCs w:val="22"/>
+        </w:rPr>
+        <w:t>.</w:t>
+      </w:r>
+      <w:r>
+        <w:rPr>
+          <w:sz w:val="22"/>
+          <w:szCs w:val="22"/>
+        </w:rPr>
+        <w:t xml:space="preserve"> </w:t>
+      </w:r>
+      <w:r>
+        <w:rPr>
+          <w:sz w:val="22"/>
+          <w:szCs w:val="22"/>
+        </w:rPr>
+        <w:t>Y</w:t>
+      </w:r>
+      <w:r>
+        <w:rPr>
+          <w:sz w:val="22"/>
+          <w:szCs w:val="22"/>
+        </w:rPr>
+        <w:t>ou should now see the connection dialog.</w:t>
+      </w:r>
+      <w:r>
+        <w:rPr>
+          <w:sz w:val="22"/>
+          <w:szCs w:val="22"/>
+        </w:rPr>
+        <w:br/>
+      </w:r>
+      <w:r>
+        <w:rPr>
+          <w:noProof/>
+          <w:sz w:val="22"/>
+          <w:szCs w:val="22"/>
+        </w:rPr>
+        <w:drawing>
+          <wp:inline distT="0" distB="0" distL="0" distR="0" wp14:anchorId="4818AD9E" wp14:editId="75C96E65">
+            <wp:extent cx="2618842" cy="3020171"/>
+            <wp:effectExtent l="0" t="0" r="0" b="8890"/>
+            <wp:docPr id="2" name="Picture 2"/>
             <wp:cNvGraphicFramePr>
               <a:graphicFrameLocks xmlns:a="http://schemas.openxmlformats.org/drawingml/2006/main" noChangeAspect="1"/>
             </wp:cNvGraphicFramePr>
@@ -1835,7 +912,7 @@
                   <pic:spPr>
                     <a:xfrm>
                       <a:off x="0" y="0"/>
-                      <a:ext cx="3221697" cy="2715634"/>
+                      <a:ext cx="2626851" cy="3029408"/>
                     </a:xfrm>
                     <a:prstGeom prst="rect">
                       <a:avLst/>
@@ -1866,21 +943,15 @@
           <w:sz w:val="22"/>
           <w:szCs w:val="22"/>
         </w:rPr>
-        <w:t>Tap</w:t>
-      </w:r>
-      <w:r>
-        <w:rPr>
-          <w:sz w:val="22"/>
-          <w:szCs w:val="22"/>
-        </w:rPr>
-        <w:t xml:space="preserve"> the connect button</w:t>
-      </w:r>
-      <w:r>
-        <w:rPr>
-          <w:sz w:val="22"/>
-          <w:szCs w:val="22"/>
-        </w:rPr>
-        <w:t>.</w:t>
+        <w:lastRenderedPageBreak/>
+        <w:t>There are a lot of options</w:t>
+      </w:r>
+      <w:r>
+        <w:rPr>
+          <w:sz w:val="22"/>
+          <w:szCs w:val="22"/>
+        </w:rPr>
+        <w:t>, but</w:t>
       </w:r>
       <w:r>
         <w:rPr>
@@ -1894,14 +965,35 @@
           <w:sz w:val="22"/>
           <w:szCs w:val="22"/>
         </w:rPr>
-        <w:t>Y</w:t>
-      </w:r>
-      <w:r>
-        <w:rPr>
-          <w:sz w:val="22"/>
-          <w:szCs w:val="22"/>
-        </w:rPr>
-        <w:t>ou should now see the connection dialog.</w:t>
+        <w:t xml:space="preserve">for this exercise </w:t>
+      </w:r>
+      <w:r>
+        <w:rPr>
+          <w:sz w:val="22"/>
+          <w:szCs w:val="22"/>
+        </w:rPr>
+        <w:t xml:space="preserve">just </w:t>
+      </w:r>
+      <w:r>
+        <w:rPr>
+          <w:sz w:val="22"/>
+          <w:szCs w:val="22"/>
+        </w:rPr>
+        <w:t>tap</w:t>
+      </w:r>
+      <w:r>
+        <w:rPr>
+          <w:sz w:val="22"/>
+          <w:szCs w:val="22"/>
+        </w:rPr>
+        <w:t xml:space="preserve"> connect. Now you should see the tester window</w:t>
+      </w:r>
+      <w:r>
+        <w:rPr>
+          <w:sz w:val="22"/>
+          <w:szCs w:val="22"/>
+        </w:rPr>
+        <w:t>:</w:t>
       </w:r>
       <w:r>
         <w:rPr>
@@ -1917,10 +1009,10 @@
           <w:szCs w:val="22"/>
         </w:rPr>
         <w:drawing>
-          <wp:inline distT="0" distB="0" distL="0" distR="0" wp14:anchorId="4818AD9E" wp14:editId="75C96E65">
-            <wp:extent cx="2618842" cy="3020171"/>
-            <wp:effectExtent l="0" t="0" r="0" b="8890"/>
-            <wp:docPr id="2" name="Picture 2"/>
+          <wp:inline distT="0" distB="0" distL="0" distR="0" wp14:anchorId="4B9D1D64" wp14:editId="657D532D">
+            <wp:extent cx="2977287" cy="2522789"/>
+            <wp:effectExtent l="0" t="0" r="0" b="0"/>
+            <wp:docPr id="3" name="Picture 3"/>
             <wp:cNvGraphicFramePr>
               <a:graphicFrameLocks xmlns:a="http://schemas.openxmlformats.org/drawingml/2006/main" noChangeAspect="1"/>
             </wp:cNvGraphicFramePr>
@@ -1940,126 +1032,6 @@
                   <pic:spPr>
                     <a:xfrm>
                       <a:off x="0" y="0"/>
-                      <a:ext cx="2626851" cy="3029408"/>
-                    </a:xfrm>
-                    <a:prstGeom prst="rect">
-                      <a:avLst/>
-                    </a:prstGeom>
-                  </pic:spPr>
-                </pic:pic>
-              </a:graphicData>
-            </a:graphic>
-          </wp:inline>
-        </w:drawing>
-      </w:r>
-    </w:p>
-    <w:p>
-      <w:pPr>
-        <w:pStyle w:val="ListParagraph"/>
-        <w:numPr>
-          <w:ilvl w:val="0"/>
-          <w:numId w:val="10"/>
-        </w:numPr>
-        <w:contextualSpacing w:val="0"/>
-        <w:rPr>
-          <w:sz w:val="22"/>
-          <w:szCs w:val="22"/>
-        </w:rPr>
-      </w:pPr>
-      <w:r>
-        <w:rPr>
-          <w:sz w:val="22"/>
-          <w:szCs w:val="22"/>
-        </w:rPr>
-        <w:lastRenderedPageBreak/>
-        <w:t>There are a lot of options</w:t>
-      </w:r>
-      <w:r>
-        <w:rPr>
-          <w:sz w:val="22"/>
-          <w:szCs w:val="22"/>
-        </w:rPr>
-        <w:t>, but</w:t>
-      </w:r>
-      <w:r>
-        <w:rPr>
-          <w:sz w:val="22"/>
-          <w:szCs w:val="22"/>
-        </w:rPr>
-        <w:t xml:space="preserve"> </w:t>
-      </w:r>
-      <w:r>
-        <w:rPr>
-          <w:sz w:val="22"/>
-          <w:szCs w:val="22"/>
-        </w:rPr>
-        <w:t xml:space="preserve">for this exercise </w:t>
-      </w:r>
-      <w:r>
-        <w:rPr>
-          <w:sz w:val="22"/>
-          <w:szCs w:val="22"/>
-        </w:rPr>
-        <w:t xml:space="preserve">just </w:t>
-      </w:r>
-      <w:r>
-        <w:rPr>
-          <w:sz w:val="22"/>
-          <w:szCs w:val="22"/>
-        </w:rPr>
-        <w:t>tap</w:t>
-      </w:r>
-      <w:r>
-        <w:rPr>
-          <w:sz w:val="22"/>
-          <w:szCs w:val="22"/>
-        </w:rPr>
-        <w:t xml:space="preserve"> connect. Now you should see the tester window</w:t>
-      </w:r>
-      <w:r>
-        <w:rPr>
-          <w:sz w:val="22"/>
-          <w:szCs w:val="22"/>
-        </w:rPr>
-        <w:t>:</w:t>
-      </w:r>
-      <w:r>
-        <w:rPr>
-          <w:sz w:val="22"/>
-          <w:szCs w:val="22"/>
-        </w:rPr>
-        <w:br/>
-      </w:r>
-      <w:r>
-        <w:rPr>
-          <w:noProof/>
-          <w:sz w:val="22"/>
-          <w:szCs w:val="22"/>
-        </w:rPr>
-        <w:drawing>
-          <wp:inline distT="0" distB="0" distL="0" distR="0" wp14:anchorId="4B9D1D64" wp14:editId="657D532D">
-            <wp:extent cx="2977287" cy="2522789"/>
-            <wp:effectExtent l="0" t="0" r="0" b="0"/>
-            <wp:docPr id="3" name="Picture 3"/>
-            <wp:cNvGraphicFramePr>
-              <a:graphicFrameLocks xmlns:a="http://schemas.openxmlformats.org/drawingml/2006/main" noChangeAspect="1"/>
-            </wp:cNvGraphicFramePr>
-            <a:graphic xmlns:a="http://schemas.openxmlformats.org/drawingml/2006/main">
-              <a:graphicData uri="http://schemas.openxmlformats.org/drawingml/2006/picture">
-                <pic:pic xmlns:pic="http://schemas.openxmlformats.org/drawingml/2006/picture">
-                  <pic:nvPicPr>
-                    <pic:cNvPr id="1" name=""/>
-                    <pic:cNvPicPr/>
-                  </pic:nvPicPr>
-                  <pic:blipFill>
-                    <a:blip r:embed="rId12"/>
-                    <a:stretch>
-                      <a:fillRect/>
-                    </a:stretch>
-                  </pic:blipFill>
-                  <pic:spPr>
-                    <a:xfrm>
-                      <a:off x="0" y="0"/>
                       <a:ext cx="3004937" cy="2546218"/>
                     </a:xfrm>
                     <a:prstGeom prst="rect">
@@ -2290,7 +1262,7 @@
                     <pic:cNvPicPr/>
                   </pic:nvPicPr>
                   <pic:blipFill>
-                    <a:blip r:embed="rId13"/>
+                    <a:blip r:embed="rId12"/>
                     <a:stretch>
                       <a:fillRect/>
                     </a:stretch>
@@ -2648,7 +1620,7 @@
                     <pic:cNvPicPr/>
                   </pic:nvPicPr>
                   <pic:blipFill>
-                    <a:blip r:embed="rId14"/>
+                    <a:blip r:embed="rId13"/>
                     <a:stretch>
                       <a:fillRect/>
                     </a:stretch>
@@ -2830,7 +1802,7 @@
                     <pic:cNvPicPr/>
                   </pic:nvPicPr>
                   <pic:blipFill>
-                    <a:blip r:embed="rId15"/>
+                    <a:blip r:embed="rId14"/>
                     <a:stretch>
                       <a:fillRect/>
                     </a:stretch>
@@ -4317,7 +3289,13 @@
         <w:pStyle w:val="Heading1"/>
       </w:pPr>
       <w:r>
-        <w:t>Task 3—WMI queries</w:t>
+        <w:t xml:space="preserve">Task </w:t>
+      </w:r>
+      <w:r>
+        <w:t>2</w:t>
+      </w:r>
+      <w:r>
+        <w:t>—WMI queries</w:t>
       </w:r>
     </w:p>
     <w:p>
@@ -5013,7 +3991,13 @@
         <w:pStyle w:val="Heading1"/>
       </w:pPr>
       <w:r>
-        <w:t xml:space="preserve">Task 4—How </w:t>
+        <w:t xml:space="preserve">Task </w:t>
+      </w:r>
+      <w:r>
+        <w:t>3</w:t>
+      </w:r>
+      <w:r>
+        <w:t xml:space="preserve">—How </w:t>
       </w:r>
       <w:r>
         <w:t>WMI</w:t>
@@ -5205,7 +4189,13 @@
         <w:pStyle w:val="Heading1"/>
       </w:pPr>
       <w:r>
-        <w:t xml:space="preserve">Task 5—WMI </w:t>
+        <w:t xml:space="preserve">Task </w:t>
+      </w:r>
+      <w:r>
+        <w:t>4</w:t>
+      </w:r>
+      <w:r>
+        <w:t xml:space="preserve">—WMI </w:t>
       </w:r>
       <w:r>
         <w:t>cmdlets in</w:t>
@@ -6629,7 +5619,7 @@
       </w:r>
     </w:p>
     <w:sectPr>
-      <w:footerReference w:type="default" r:id="rId16"/>
+      <w:footerReference w:type="default" r:id="rId15"/>
       <w:pgSz w:w="12240" w:h="15840"/>
       <w:pgMar w:top="720" w:right="720" w:bottom="1152" w:left="720" w:header="0" w:footer="288" w:gutter="0"/>
       <w:cols w:space="720"/>
@@ -6783,7 +5773,7 @@
         <w:sz w:val="16"/>
         <w:szCs w:val="18"/>
       </w:rPr>
-      <w:t>2025</w:t>
+      <w:t>2026</w:t>
     </w:r>
     <w:r>
       <w:rPr>
@@ -7491,6 +6481,119 @@
     </w:lvl>
   </w:abstractNum>
   <w:abstractNum w:abstractNumId="6" w15:restartNumberingAfterBreak="0">
+    <w:nsid w:val="41A052ED"/>
+    <w:multiLevelType w:val="hybridMultilevel"/>
+    <w:tmpl w:val="323C9DF2"/>
+    <w:lvl w:ilvl="0" w:tplc="04090001">
+      <w:start w:val="1"/>
+      <w:numFmt w:val="bullet"/>
+      <w:lvlText w:val=""/>
+      <w:lvlJc w:val="left"/>
+      <w:pPr>
+        <w:ind w:left="720" w:hanging="360"/>
+      </w:pPr>
+      <w:rPr>
+        <w:rFonts w:ascii="Symbol" w:hAnsi="Symbol" w:hint="default"/>
+      </w:rPr>
+    </w:lvl>
+    <w:lvl w:ilvl="1" w:tplc="04090003" w:tentative="1">
+      <w:start w:val="1"/>
+      <w:numFmt w:val="bullet"/>
+      <w:lvlText w:val="o"/>
+      <w:lvlJc w:val="left"/>
+      <w:pPr>
+        <w:ind w:left="1440" w:hanging="360"/>
+      </w:pPr>
+      <w:rPr>
+        <w:rFonts w:ascii="Courier New" w:hAnsi="Courier New" w:cs="Courier New" w:hint="default"/>
+      </w:rPr>
+    </w:lvl>
+    <w:lvl w:ilvl="2" w:tplc="04090005" w:tentative="1">
+      <w:start w:val="1"/>
+      <w:numFmt w:val="bullet"/>
+      <w:lvlText w:val=""/>
+      <w:lvlJc w:val="left"/>
+      <w:pPr>
+        <w:ind w:left="2160" w:hanging="360"/>
+      </w:pPr>
+      <w:rPr>
+        <w:rFonts w:ascii="Wingdings" w:hAnsi="Wingdings" w:hint="default"/>
+      </w:rPr>
+    </w:lvl>
+    <w:lvl w:ilvl="3" w:tplc="04090001" w:tentative="1">
+      <w:start w:val="1"/>
+      <w:numFmt w:val="bullet"/>
+      <w:lvlText w:val=""/>
+      <w:lvlJc w:val="left"/>
+      <w:pPr>
+        <w:ind w:left="2880" w:hanging="360"/>
+      </w:pPr>
+      <w:rPr>
+        <w:rFonts w:ascii="Symbol" w:hAnsi="Symbol" w:hint="default"/>
+      </w:rPr>
+    </w:lvl>
+    <w:lvl w:ilvl="4" w:tplc="04090003" w:tentative="1">
+      <w:start w:val="1"/>
+      <w:numFmt w:val="bullet"/>
+      <w:lvlText w:val="o"/>
+      <w:lvlJc w:val="left"/>
+      <w:pPr>
+        <w:ind w:left="3600" w:hanging="360"/>
+      </w:pPr>
+      <w:rPr>
+        <w:rFonts w:ascii="Courier New" w:hAnsi="Courier New" w:cs="Courier New" w:hint="default"/>
+      </w:rPr>
+    </w:lvl>
+    <w:lvl w:ilvl="5" w:tplc="04090005" w:tentative="1">
+      <w:start w:val="1"/>
+      <w:numFmt w:val="bullet"/>
+      <w:lvlText w:val=""/>
+      <w:lvlJc w:val="left"/>
+      <w:pPr>
+        <w:ind w:left="4320" w:hanging="360"/>
+      </w:pPr>
+      <w:rPr>
+        <w:rFonts w:ascii="Wingdings" w:hAnsi="Wingdings" w:hint="default"/>
+      </w:rPr>
+    </w:lvl>
+    <w:lvl w:ilvl="6" w:tplc="04090001" w:tentative="1">
+      <w:start w:val="1"/>
+      <w:numFmt w:val="bullet"/>
+      <w:lvlText w:val=""/>
+      <w:lvlJc w:val="left"/>
+      <w:pPr>
+        <w:ind w:left="5040" w:hanging="360"/>
+      </w:pPr>
+      <w:rPr>
+        <w:rFonts w:ascii="Symbol" w:hAnsi="Symbol" w:hint="default"/>
+      </w:rPr>
+    </w:lvl>
+    <w:lvl w:ilvl="7" w:tplc="04090003" w:tentative="1">
+      <w:start w:val="1"/>
+      <w:numFmt w:val="bullet"/>
+      <w:lvlText w:val="o"/>
+      <w:lvlJc w:val="left"/>
+      <w:pPr>
+        <w:ind w:left="5760" w:hanging="360"/>
+      </w:pPr>
+      <w:rPr>
+        <w:rFonts w:ascii="Courier New" w:hAnsi="Courier New" w:cs="Courier New" w:hint="default"/>
+      </w:rPr>
+    </w:lvl>
+    <w:lvl w:ilvl="8" w:tplc="04090005" w:tentative="1">
+      <w:start w:val="1"/>
+      <w:numFmt w:val="bullet"/>
+      <w:lvlText w:val=""/>
+      <w:lvlJc w:val="left"/>
+      <w:pPr>
+        <w:ind w:left="6480" w:hanging="360"/>
+      </w:pPr>
+      <w:rPr>
+        <w:rFonts w:ascii="Wingdings" w:hAnsi="Wingdings" w:hint="default"/>
+      </w:rPr>
+    </w:lvl>
+  </w:abstractNum>
+  <w:abstractNum w:abstractNumId="7" w15:restartNumberingAfterBreak="0">
     <w:nsid w:val="453C46B0"/>
     <w:multiLevelType w:val="multilevel"/>
     <w:tmpl w:val="0409001F"/>
@@ -7576,7 +6679,7 @@
       </w:pPr>
     </w:lvl>
   </w:abstractNum>
-  <w:abstractNum w:abstractNumId="7" w15:restartNumberingAfterBreak="0">
+  <w:abstractNum w:abstractNumId="8" w15:restartNumberingAfterBreak="0">
     <w:nsid w:val="45755B2E"/>
     <w:multiLevelType w:val="multilevel"/>
     <w:tmpl w:val="0409001F"/>
@@ -7662,7 +6765,7 @@
       </w:pPr>
     </w:lvl>
   </w:abstractNum>
-  <w:abstractNum w:abstractNumId="8" w15:restartNumberingAfterBreak="0">
+  <w:abstractNum w:abstractNumId="9" w15:restartNumberingAfterBreak="0">
     <w:nsid w:val="4A613513"/>
     <w:multiLevelType w:val="hybridMultilevel"/>
     <w:tmpl w:val="CACEDB98"/>
@@ -7775,7 +6878,7 @@
       </w:rPr>
     </w:lvl>
   </w:abstractNum>
-  <w:abstractNum w:abstractNumId="9" w15:restartNumberingAfterBreak="0">
+  <w:abstractNum w:abstractNumId="10" w15:restartNumberingAfterBreak="0">
     <w:nsid w:val="58A5720B"/>
     <w:multiLevelType w:val="multilevel"/>
     <w:tmpl w:val="0409001F"/>
@@ -7861,7 +6964,7 @@
       </w:pPr>
     </w:lvl>
   </w:abstractNum>
-  <w:abstractNum w:abstractNumId="10" w15:restartNumberingAfterBreak="0">
+  <w:abstractNum w:abstractNumId="11" w15:restartNumberingAfterBreak="0">
     <w:nsid w:val="592A6AB0"/>
     <w:multiLevelType w:val="hybridMultilevel"/>
     <w:tmpl w:val="5FF8374C"/>
@@ -7974,7 +7077,7 @@
       </w:rPr>
     </w:lvl>
   </w:abstractNum>
-  <w:abstractNum w:abstractNumId="11" w15:restartNumberingAfterBreak="0">
+  <w:abstractNum w:abstractNumId="12" w15:restartNumberingAfterBreak="0">
     <w:nsid w:val="64666558"/>
     <w:multiLevelType w:val="hybridMultilevel"/>
     <w:tmpl w:val="6C766844"/>
@@ -8087,7 +7190,7 @@
       </w:rPr>
     </w:lvl>
   </w:abstractNum>
-  <w:abstractNum w:abstractNumId="12" w15:restartNumberingAfterBreak="0">
+  <w:abstractNum w:abstractNumId="13" w15:restartNumberingAfterBreak="0">
     <w:nsid w:val="76EA4111"/>
     <w:multiLevelType w:val="multilevel"/>
     <w:tmpl w:val="0409001F"/>
@@ -8174,25 +7277,25 @@
     </w:lvl>
   </w:abstractNum>
   <w:num w:numId="1" w16cid:durableId="481849223">
-    <w:abstractNumId w:val="8"/>
+    <w:abstractNumId w:val="9"/>
   </w:num>
   <w:num w:numId="2" w16cid:durableId="400907750">
     <w:abstractNumId w:val="1"/>
   </w:num>
   <w:num w:numId="3" w16cid:durableId="1749768900">
+    <w:abstractNumId w:val="13"/>
+  </w:num>
+  <w:num w:numId="4" w16cid:durableId="12851133">
     <w:abstractNumId w:val="12"/>
   </w:num>
-  <w:num w:numId="4" w16cid:durableId="12851133">
+  <w:num w:numId="5" w16cid:durableId="1090925182">
     <w:abstractNumId w:val="11"/>
   </w:num>
-  <w:num w:numId="5" w16cid:durableId="1090925182">
-    <w:abstractNumId w:val="10"/>
-  </w:num>
   <w:num w:numId="6" w16cid:durableId="1077165514">
-    <w:abstractNumId w:val="7"/>
+    <w:abstractNumId w:val="8"/>
   </w:num>
   <w:num w:numId="7" w16cid:durableId="586960846">
-    <w:abstractNumId w:val="6"/>
+    <w:abstractNumId w:val="7"/>
   </w:num>
   <w:num w:numId="8" w16cid:durableId="264850957">
     <w:abstractNumId w:val="0"/>
@@ -8207,10 +7310,13 @@
     <w:abstractNumId w:val="2"/>
   </w:num>
   <w:num w:numId="12" w16cid:durableId="967126064">
-    <w:abstractNumId w:val="9"/>
+    <w:abstractNumId w:val="10"/>
   </w:num>
   <w:num w:numId="13" w16cid:durableId="457142339">
     <w:abstractNumId w:val="4"/>
+  </w:num>
+  <w:num w:numId="14" w16cid:durableId="697698689">
+    <w:abstractNumId w:val="6"/>
   </w:num>
   <w:numIdMacAtCleanup w:val="8"/>
 </w:numbering>
@@ -9760,316 +8866,6 @@
               <w:rStyle w:val="PlaceholderText"/>
             </w:rPr>
             <w:t>Click here to enter id</w:t>
-          </w:r>
-        </w:p>
-      </w:docPartBody>
-    </w:docPart>
-    <w:docPart>
-      <w:docPartPr>
-        <w:name w:val="8FA4E9301FF6415DB984F1EB81B6DEA5"/>
-        <w:category>
-          <w:name w:val="General"/>
-          <w:gallery w:val="placeholder"/>
-        </w:category>
-        <w:types>
-          <w:type w:val="bbPlcHdr"/>
-        </w:types>
-        <w:behaviors>
-          <w:behavior w:val="content"/>
-        </w:behaviors>
-        <w:guid w:val="{10276949-F55A-414C-BCC2-F3225EEA8866}"/>
-      </w:docPartPr>
-      <w:docPartBody>
-        <w:p>
-          <w:pPr>
-            <w:pStyle w:val="8FA4E9301FF6415DB984F1EB81B6DEA51"/>
-          </w:pPr>
-          <w:r>
-            <w:rPr>
-              <w:rStyle w:val="PlaceholderText"/>
-              <w:sz w:val="22"/>
-              <w:szCs w:val="22"/>
-            </w:rPr>
-            <w:t>Click or tap here to enter text.</w:t>
-          </w:r>
-        </w:p>
-      </w:docPartBody>
-    </w:docPart>
-    <w:docPart>
-      <w:docPartPr>
-        <w:name w:val="DA20C8477E6E43F0B5F01D171B90F4D9"/>
-        <w:category>
-          <w:name w:val="General"/>
-          <w:gallery w:val="placeholder"/>
-        </w:category>
-        <w:types>
-          <w:type w:val="bbPlcHdr"/>
-        </w:types>
-        <w:behaviors>
-          <w:behavior w:val="content"/>
-        </w:behaviors>
-        <w:guid w:val="{D4A55C46-7A95-418C-99AF-D0E85BCE9646}"/>
-      </w:docPartPr>
-      <w:docPartBody>
-        <w:p>
-          <w:pPr>
-            <w:pStyle w:val="DA20C8477E6E43F0B5F01D171B90F4D91"/>
-          </w:pPr>
-          <w:r>
-            <w:rPr>
-              <w:rStyle w:val="PlaceholderText"/>
-              <w:sz w:val="22"/>
-              <w:szCs w:val="22"/>
-            </w:rPr>
-            <w:t>Click or tap here to enter text.</w:t>
-          </w:r>
-        </w:p>
-      </w:docPartBody>
-    </w:docPart>
-    <w:docPart>
-      <w:docPartPr>
-        <w:name w:val="3814FEE2A0D847BBABBC6B3D4287482C"/>
-        <w:category>
-          <w:name w:val="General"/>
-          <w:gallery w:val="placeholder"/>
-        </w:category>
-        <w:types>
-          <w:type w:val="bbPlcHdr"/>
-        </w:types>
-        <w:behaviors>
-          <w:behavior w:val="content"/>
-        </w:behaviors>
-        <w:guid w:val="{46752B98-F3DD-40BB-82AF-60E623D727E1}"/>
-      </w:docPartPr>
-      <w:docPartBody>
-        <w:p>
-          <w:pPr>
-            <w:pStyle w:val="3814FEE2A0D847BBABBC6B3D4287482C1"/>
-          </w:pPr>
-          <w:r>
-            <w:rPr>
-              <w:rStyle w:val="PlaceholderText"/>
-              <w:sz w:val="22"/>
-              <w:szCs w:val="22"/>
-            </w:rPr>
-            <w:t>Click or tap here to enter text.</w:t>
-          </w:r>
-        </w:p>
-      </w:docPartBody>
-    </w:docPart>
-    <w:docPart>
-      <w:docPartPr>
-        <w:name w:val="619B9E27C1F140BCBA5A7967BA666CF9"/>
-        <w:category>
-          <w:name w:val="General"/>
-          <w:gallery w:val="placeholder"/>
-        </w:category>
-        <w:types>
-          <w:type w:val="bbPlcHdr"/>
-        </w:types>
-        <w:behaviors>
-          <w:behavior w:val="content"/>
-        </w:behaviors>
-        <w:guid w:val="{40082347-F916-4B0A-88E2-4A557F3E9EFD}"/>
-      </w:docPartPr>
-      <w:docPartBody>
-        <w:p>
-          <w:pPr>
-            <w:pStyle w:val="619B9E27C1F140BCBA5A7967BA666CF91"/>
-          </w:pPr>
-          <w:r>
-            <w:rPr>
-              <w:rStyle w:val="PlaceholderText"/>
-              <w:sz w:val="22"/>
-              <w:szCs w:val="22"/>
-            </w:rPr>
-            <w:t>Click or tap here to enter text.</w:t>
-          </w:r>
-        </w:p>
-      </w:docPartBody>
-    </w:docPart>
-    <w:docPart>
-      <w:docPartPr>
-        <w:name w:val="9E72D17B261D4A5D9E6B522010C22637"/>
-        <w:category>
-          <w:name w:val="General"/>
-          <w:gallery w:val="placeholder"/>
-        </w:category>
-        <w:types>
-          <w:type w:val="bbPlcHdr"/>
-        </w:types>
-        <w:behaviors>
-          <w:behavior w:val="content"/>
-        </w:behaviors>
-        <w:guid w:val="{E1A29CC4-761D-4682-A5A6-F465A41C762C}"/>
-      </w:docPartPr>
-      <w:docPartBody>
-        <w:p>
-          <w:pPr>
-            <w:pStyle w:val="9E72D17B261D4A5D9E6B522010C226371"/>
-          </w:pPr>
-          <w:r>
-            <w:rPr>
-              <w:rStyle w:val="PlaceholderText"/>
-              <w:sz w:val="22"/>
-              <w:szCs w:val="22"/>
-            </w:rPr>
-            <w:t>Click or tap here to enter text.</w:t>
-          </w:r>
-        </w:p>
-      </w:docPartBody>
-    </w:docPart>
-    <w:docPart>
-      <w:docPartPr>
-        <w:name w:val="8AAAE8712DA04C2AB0BA55AE98F1936A"/>
-        <w:category>
-          <w:name w:val="General"/>
-          <w:gallery w:val="placeholder"/>
-        </w:category>
-        <w:types>
-          <w:type w:val="bbPlcHdr"/>
-        </w:types>
-        <w:behaviors>
-          <w:behavior w:val="content"/>
-        </w:behaviors>
-        <w:guid w:val="{A1A2143C-C5FE-4B00-86B5-32F43D71F7BE}"/>
-      </w:docPartPr>
-      <w:docPartBody>
-        <w:p>
-          <w:pPr>
-            <w:pStyle w:val="8AAAE8712DA04C2AB0BA55AE98F1936A1"/>
-          </w:pPr>
-          <w:r>
-            <w:rPr>
-              <w:rStyle w:val="PlaceholderText"/>
-              <w:sz w:val="22"/>
-              <w:szCs w:val="22"/>
-            </w:rPr>
-            <w:t>Click or tap here to enter text.</w:t>
-          </w:r>
-        </w:p>
-      </w:docPartBody>
-    </w:docPart>
-    <w:docPart>
-      <w:docPartPr>
-        <w:name w:val="4B88A26A71E6477395276AB8D6CC06B9"/>
-        <w:category>
-          <w:name w:val="General"/>
-          <w:gallery w:val="placeholder"/>
-        </w:category>
-        <w:types>
-          <w:type w:val="bbPlcHdr"/>
-        </w:types>
-        <w:behaviors>
-          <w:behavior w:val="content"/>
-        </w:behaviors>
-        <w:guid w:val="{78A8D61A-A9B8-4234-A6D8-2761D7938B10}"/>
-      </w:docPartPr>
-      <w:docPartBody>
-        <w:p>
-          <w:pPr>
-            <w:pStyle w:val="4B88A26A71E6477395276AB8D6CC06B91"/>
-          </w:pPr>
-          <w:r>
-            <w:rPr>
-              <w:rStyle w:val="PlaceholderText"/>
-              <w:sz w:val="22"/>
-              <w:szCs w:val="22"/>
-            </w:rPr>
-            <w:t>Click or tap here to enter text.</w:t>
-          </w:r>
-        </w:p>
-      </w:docPartBody>
-    </w:docPart>
-    <w:docPart>
-      <w:docPartPr>
-        <w:name w:val="FD7B5F1073894CCAB09EF2DF50B6EAAF"/>
-        <w:category>
-          <w:name w:val="General"/>
-          <w:gallery w:val="placeholder"/>
-        </w:category>
-        <w:types>
-          <w:type w:val="bbPlcHdr"/>
-        </w:types>
-        <w:behaviors>
-          <w:behavior w:val="content"/>
-        </w:behaviors>
-        <w:guid w:val="{9D09B87C-B419-424E-8746-A29DD5CA2E4C}"/>
-      </w:docPartPr>
-      <w:docPartBody>
-        <w:p>
-          <w:pPr>
-            <w:pStyle w:val="FD7B5F1073894CCAB09EF2DF50B6EAAF1"/>
-          </w:pPr>
-          <w:r>
-            <w:rPr>
-              <w:rStyle w:val="PlaceholderText"/>
-              <w:sz w:val="22"/>
-              <w:szCs w:val="22"/>
-            </w:rPr>
-            <w:t>Click or tap here to enter text.</w:t>
-          </w:r>
-        </w:p>
-      </w:docPartBody>
-    </w:docPart>
-    <w:docPart>
-      <w:docPartPr>
-        <w:name w:val="3EA446EDEB9D43FAB59B89AFD48F9010"/>
-        <w:category>
-          <w:name w:val="General"/>
-          <w:gallery w:val="placeholder"/>
-        </w:category>
-        <w:types>
-          <w:type w:val="bbPlcHdr"/>
-        </w:types>
-        <w:behaviors>
-          <w:behavior w:val="content"/>
-        </w:behaviors>
-        <w:guid w:val="{129C2879-2EC5-4B2B-9216-87A0B9EDC51E}"/>
-      </w:docPartPr>
-      <w:docPartBody>
-        <w:p>
-          <w:pPr>
-            <w:pStyle w:val="3EA446EDEB9D43FAB59B89AFD48F90101"/>
-          </w:pPr>
-          <w:r>
-            <w:rPr>
-              <w:rStyle w:val="PlaceholderText"/>
-              <w:sz w:val="22"/>
-              <w:szCs w:val="22"/>
-            </w:rPr>
-            <w:t>Click or tap here to enter text.</w:t>
-          </w:r>
-        </w:p>
-      </w:docPartBody>
-    </w:docPart>
-    <w:docPart>
-      <w:docPartPr>
-        <w:name w:val="80896633EDBA4F8E99226D3766FC3272"/>
-        <w:category>
-          <w:name w:val="General"/>
-          <w:gallery w:val="placeholder"/>
-        </w:category>
-        <w:types>
-          <w:type w:val="bbPlcHdr"/>
-        </w:types>
-        <w:behaviors>
-          <w:behavior w:val="content"/>
-        </w:behaviors>
-        <w:guid w:val="{D4D33A50-E9A7-48AA-9FE6-C7ADDE250B03}"/>
-      </w:docPartPr>
-      <w:docPartBody>
-        <w:p>
-          <w:pPr>
-            <w:pStyle w:val="80896633EDBA4F8E99226D3766FC32721"/>
-          </w:pPr>
-          <w:r>
-            <w:rPr>
-              <w:rStyle w:val="PlaceholderText"/>
-              <w:sz w:val="22"/>
-              <w:szCs w:val="22"/>
-            </w:rPr>
-            <w:t>Click or tap here to enter text.</w:t>
           </w:r>
         </w:p>
       </w:docPartBody>
@@ -10896,6 +9692,7 @@
     <w:rsid w:val="007C7A24"/>
     <w:rsid w:val="007E6374"/>
     <w:rsid w:val="00854407"/>
+    <w:rsid w:val="008B2867"/>
     <w:rsid w:val="00994961"/>
     <w:rsid w:val="00A8380A"/>
     <w:rsid w:val="00AD1DF9"/>
@@ -10907,6 +9704,7 @@
     <w:rsid w:val="00C04E53"/>
     <w:rsid w:val="00C40C05"/>
     <w:rsid w:val="00C428B3"/>
+    <w:rsid w:val="00C47F14"/>
     <w:rsid w:val="00C84655"/>
     <w:rsid w:val="00CD377E"/>
     <w:rsid w:val="00D16251"/>

</xml_diff>